<commit_message>
Calificado 1 grupal ampliado (variables, metadatos, calidad con IA, BD El Buen Sabor, SQL) con código, capturas y rúbrica enlazada; capturas en Dirigido 2
Co-Authored-By: Claude Sonnet 5.5 <noreply@anthropic.com>
Claude-Session: https://claude.ai/code/session_01HWf88gfjbnyHET9WH8GMM1
</commit_message>
<xml_diff>
--- a/laboratorios_fgd/LAB-D2-FGD-2026II-DOCENTE-RESUELTO.docx
+++ b/laboratorios_fgd/LAB-D2-FGD-2026II-DOCENTE-RESUELTO.docx
@@ -1958,7 +1958,7 @@
     </w:p>
     <w:p>
       <w:pPr>
-        <w:spacing w:after="240" w:before="40"/>
+        <w:spacing w:after="160" w:before="40"/>
       </w:pPr>
       <w:r>
         <w:t xml:space="preserve">¿Qué cláusula fue decisiva y qué permite concluir este resultado? ____________________</w:t>
@@ -2086,7 +2086,7 @@
     </w:p>
     <w:p>
       <w:pPr>
-        <w:spacing w:after="240" w:before="40"/>
+        <w:spacing w:after="160" w:before="40"/>
       </w:pPr>
       <w:r>
         <w:t xml:space="preserve">¿Qué cláusula fue decisiva y qué permite concluir este resultado? ____________________</w:t>
@@ -2214,7 +2214,7 @@
     </w:p>
     <w:p>
       <w:pPr>
-        <w:spacing w:after="240" w:before="40"/>
+        <w:spacing w:after="160" w:before="40"/>
       </w:pPr>
       <w:r>
         <w:t xml:space="preserve">¿Qué cláusula fue decisiva y qué permite concluir este resultado? ____________________</w:t>
@@ -2342,11 +2342,72 @@
     </w:p>
     <w:p>
       <w:pPr>
-        <w:spacing w:after="240" w:before="40"/>
+        <w:spacing w:after="160" w:before="40"/>
       </w:pPr>
       <w:r>
         <w:t xml:space="preserve">¿Qué cláusula fue decisiva y qué permite concluir este resultado? ____________________</w:t>
       </w:r>
+    </w:p>
+    <w:tbl>
+      <w:tblPr>
+        <w:tblW w:type="dxa" w:w="9638"/>
+        <w:tblBorders>
+          <w:top w:val="single" w:color="auto" w:sz="4"/>
+          <w:left w:val="single" w:color="auto" w:sz="4"/>
+          <w:bottom w:val="single" w:color="auto" w:sz="4"/>
+          <w:right w:val="single" w:color="auto" w:sz="4"/>
+          <w:insideH w:val="single" w:color="auto" w:sz="4"/>
+          <w:insideV w:val="single" w:color="auto" w:sz="4"/>
+        </w:tblBorders>
+      </w:tblPr>
+      <w:tblGrid>
+        <w:gridCol w:w="9638"/>
+      </w:tblGrid>
+      <w:tr>
+        <w:trPr>
+          <w:cantSplit/>
+          <w:trHeight w:val="1800" w:hRule="atLeast"/>
+        </w:trPr>
+        <w:tc>
+          <w:tcPr>
+            <w:tcW w:type="dxa" w:w="9638"/>
+            <w:tcBorders>
+              <w:top w:val="dashed" w:color="808080" w:sz="6"/>
+              <w:left w:val="dashed" w:color="808080" w:sz="6"/>
+              <w:bottom w:val="dashed" w:color="808080" w:sz="6"/>
+              <w:right w:val="dashed" w:color="808080" w:sz="6"/>
+            </w:tcBorders>
+            <w:tcMar>
+              <w:top w:type="dxa" w:w="80"/>
+              <w:left w:type="dxa" w:w="90"/>
+              <w:bottom w:type="dxa" w:w="80"/>
+              <w:right w:type="dxa" w:w="90"/>
+            </w:tcMar>
+            <w:vAlign w:val="center"/>
+          </w:tcPr>
+          <w:p>
+            <w:pPr>
+              <w:spacing w:after="0"/>
+              <w:jc w:val="center"/>
+            </w:pPr>
+            <w:r>
+              <w:rPr>
+                <w:i/>
+                <w:iCs/>
+                <w:color w:val="5A6672"/>
+                <w:sz w:val="20"/>
+                <w:szCs w:val="20"/>
+              </w:rPr>
+              <w:t xml:space="preserve">Pegue aquí la captura de pantalla de la salida de la salida de P1 — Ahora participa el estudiante en su notebook.</w:t>
+            </w:r>
+          </w:p>
+        </w:tc>
+      </w:tr>
+    </w:tbl>
+    <w:p>
+      <w:pPr>
+        <w:spacing w:after="160"/>
+      </w:pPr>
     </w:p>
     <w:p>
       <w:pPr>
@@ -2485,7 +2546,7 @@
     </w:p>
     <w:p>
       <w:pPr>
-        <w:spacing w:after="240" w:before="40"/>
+        <w:spacing w:after="160" w:before="40"/>
       </w:pPr>
       <w:r>
         <w:t xml:space="preserve">¿Qué cláusula fue decisiva y qué permite concluir este resultado? ____________________</w:t>
@@ -2628,7 +2689,7 @@
     </w:p>
     <w:p>
       <w:pPr>
-        <w:spacing w:after="240" w:before="40"/>
+        <w:spacing w:after="160" w:before="40"/>
       </w:pPr>
       <w:r>
         <w:t xml:space="preserve">¿Qué cláusula fue decisiva y qué permite concluir este resultado? ____________________</w:t>
@@ -2771,7 +2832,7 @@
     </w:p>
     <w:p>
       <w:pPr>
-        <w:spacing w:after="240" w:before="40"/>
+        <w:spacing w:after="160" w:before="40"/>
       </w:pPr>
       <w:r>
         <w:t xml:space="preserve">¿Qué cláusula fue decisiva y qué permite concluir este resultado? ____________________</w:t>
@@ -2929,11 +2990,72 @@
     </w:p>
     <w:p>
       <w:pPr>
-        <w:spacing w:after="240" w:before="40"/>
+        <w:spacing w:after="160" w:before="40"/>
       </w:pPr>
       <w:r>
         <w:t xml:space="preserve">¿Qué cláusula fue decisiva y qué permite concluir este resultado? ____________________</w:t>
       </w:r>
+    </w:p>
+    <w:tbl>
+      <w:tblPr>
+        <w:tblW w:type="dxa" w:w="9638"/>
+        <w:tblBorders>
+          <w:top w:val="single" w:color="auto" w:sz="4"/>
+          <w:left w:val="single" w:color="auto" w:sz="4"/>
+          <w:bottom w:val="single" w:color="auto" w:sz="4"/>
+          <w:right w:val="single" w:color="auto" w:sz="4"/>
+          <w:insideH w:val="single" w:color="auto" w:sz="4"/>
+          <w:insideV w:val="single" w:color="auto" w:sz="4"/>
+        </w:tblBorders>
+      </w:tblPr>
+      <w:tblGrid>
+        <w:gridCol w:w="9638"/>
+      </w:tblGrid>
+      <w:tr>
+        <w:trPr>
+          <w:cantSplit/>
+          <w:trHeight w:val="1800" w:hRule="atLeast"/>
+        </w:trPr>
+        <w:tc>
+          <w:tcPr>
+            <w:tcW w:type="dxa" w:w="9638"/>
+            <w:tcBorders>
+              <w:top w:val="dashed" w:color="808080" w:sz="6"/>
+              <w:left w:val="dashed" w:color="808080" w:sz="6"/>
+              <w:bottom w:val="dashed" w:color="808080" w:sz="6"/>
+              <w:right w:val="dashed" w:color="808080" w:sz="6"/>
+            </w:tcBorders>
+            <w:tcMar>
+              <w:top w:type="dxa" w:w="80"/>
+              <w:left w:type="dxa" w:w="90"/>
+              <w:bottom w:type="dxa" w:w="80"/>
+              <w:right w:type="dxa" w:w="90"/>
+            </w:tcMar>
+            <w:vAlign w:val="center"/>
+          </w:tcPr>
+          <w:p>
+            <w:pPr>
+              <w:spacing w:after="0"/>
+              <w:jc w:val="center"/>
+            </w:pPr>
+            <w:r>
+              <w:rPr>
+                <w:i/>
+                <w:iCs/>
+                <w:color w:val="5A6672"/>
+                <w:sz w:val="20"/>
+                <w:szCs w:val="20"/>
+              </w:rPr>
+              <w:t xml:space="preserve">Pegue aquí la captura de pantalla de la salida de la salida de P2 — Ahora participa el estudiante en su notebook.</w:t>
+            </w:r>
+          </w:p>
+        </w:tc>
+      </w:tr>
+    </w:tbl>
+    <w:p>
+      <w:pPr>
+        <w:spacing w:after="160"/>
+      </w:pPr>
     </w:p>
     <w:p>
       <w:pPr>
@@ -3072,7 +3194,7 @@
     </w:p>
     <w:p>
       <w:pPr>
-        <w:spacing w:after="240" w:before="40"/>
+        <w:spacing w:after="160" w:before="40"/>
       </w:pPr>
       <w:r>
         <w:t xml:space="preserve">¿Qué cláusula fue decisiva y qué permite concluir este resultado? ____________________</w:t>
@@ -3200,7 +3322,7 @@
     </w:p>
     <w:p>
       <w:pPr>
-        <w:spacing w:after="240" w:before="40"/>
+        <w:spacing w:after="160" w:before="40"/>
       </w:pPr>
       <w:r>
         <w:t xml:space="preserve">¿Qué cláusula fue decisiva y qué permite concluir este resultado? ____________________</w:t>
@@ -3313,7 +3435,7 @@
     </w:p>
     <w:p>
       <w:pPr>
-        <w:spacing w:after="240" w:before="40"/>
+        <w:spacing w:after="160" w:before="40"/>
       </w:pPr>
       <w:r>
         <w:t xml:space="preserve">¿Qué cláusula fue decisiva y qué permite concluir este resultado? ____________________</w:t>
@@ -3441,11 +3563,72 @@
     </w:p>
     <w:p>
       <w:pPr>
-        <w:spacing w:after="240" w:before="40"/>
+        <w:spacing w:after="160" w:before="40"/>
       </w:pPr>
       <w:r>
         <w:t xml:space="preserve">¿Qué cláusula fue decisiva y qué permite concluir este resultado? ____________________</w:t>
       </w:r>
+    </w:p>
+    <w:tbl>
+      <w:tblPr>
+        <w:tblW w:type="dxa" w:w="9638"/>
+        <w:tblBorders>
+          <w:top w:val="single" w:color="auto" w:sz="4"/>
+          <w:left w:val="single" w:color="auto" w:sz="4"/>
+          <w:bottom w:val="single" w:color="auto" w:sz="4"/>
+          <w:right w:val="single" w:color="auto" w:sz="4"/>
+          <w:insideH w:val="single" w:color="auto" w:sz="4"/>
+          <w:insideV w:val="single" w:color="auto" w:sz="4"/>
+        </w:tblBorders>
+      </w:tblPr>
+      <w:tblGrid>
+        <w:gridCol w:w="9638"/>
+      </w:tblGrid>
+      <w:tr>
+        <w:trPr>
+          <w:cantSplit/>
+          <w:trHeight w:val="1800" w:hRule="atLeast"/>
+        </w:trPr>
+        <w:tc>
+          <w:tcPr>
+            <w:tcW w:type="dxa" w:w="9638"/>
+            <w:tcBorders>
+              <w:top w:val="dashed" w:color="808080" w:sz="6"/>
+              <w:left w:val="dashed" w:color="808080" w:sz="6"/>
+              <w:bottom w:val="dashed" w:color="808080" w:sz="6"/>
+              <w:right w:val="dashed" w:color="808080" w:sz="6"/>
+            </w:tcBorders>
+            <w:tcMar>
+              <w:top w:type="dxa" w:w="80"/>
+              <w:left w:type="dxa" w:w="90"/>
+              <w:bottom w:type="dxa" w:w="80"/>
+              <w:right w:type="dxa" w:w="90"/>
+            </w:tcMar>
+            <w:vAlign w:val="center"/>
+          </w:tcPr>
+          <w:p>
+            <w:pPr>
+              <w:spacing w:after="0"/>
+              <w:jc w:val="center"/>
+            </w:pPr>
+            <w:r>
+              <w:rPr>
+                <w:i/>
+                <w:iCs/>
+                <w:color w:val="5A6672"/>
+                <w:sz w:val="20"/>
+                <w:szCs w:val="20"/>
+              </w:rPr>
+              <w:t xml:space="preserve">Pegue aquí la captura de pantalla de la salida de la salida de P3 — Ahora participa el estudiante en su notebook.</w:t>
+            </w:r>
+          </w:p>
+        </w:tc>
+      </w:tr>
+    </w:tbl>
+    <w:p>
+      <w:pPr>
+        <w:spacing w:after="160"/>
+      </w:pPr>
     </w:p>
     <w:p>
       <w:pPr>
@@ -3613,20 +3796,89 @@
         <w:t xml:space="preserve">  [('Pollo a la plancha', 3, 99.0), ('Ceviche', 2, 84.0), ('Pollo a la plancha', 2, 66.0)]</w:t>
       </w:r>
     </w:p>
-    <w:p>
-      <w:pPr>
-        <w:spacing w:after="0" w:before="80"/>
-      </w:pPr>
-      <w:r>
-        <w:t xml:space="preserve">Interpretación: ________________________________________________</w:t>
-      </w:r>
-    </w:p>
-    <w:p>
-      <w:pPr>
-        <w:spacing w:after="240" w:before="80"/>
-      </w:pPr>
-      <w:r>
-        <w:t xml:space="preserve">________________________________________________________________</w:t>
+    <w:tbl>
+      <w:tblPr>
+        <w:tblW w:type="dxa" w:w="9638"/>
+        <w:tblBorders>
+          <w:top w:val="single" w:color="auto" w:sz="4"/>
+          <w:left w:val="single" w:color="auto" w:sz="4"/>
+          <w:bottom w:val="single" w:color="auto" w:sz="4"/>
+          <w:right w:val="single" w:color="auto" w:sz="4"/>
+          <w:insideH w:val="single" w:color="auto" w:sz="4"/>
+          <w:insideV w:val="single" w:color="auto" w:sz="4"/>
+        </w:tblBorders>
+      </w:tblPr>
+      <w:tblGrid>
+        <w:gridCol w:w="9638"/>
+      </w:tblGrid>
+      <w:tr>
+        <w:trPr>
+          <w:cantSplit/>
+          <w:trHeight w:val="1800" w:hRule="atLeast"/>
+        </w:trPr>
+        <w:tc>
+          <w:tcPr>
+            <w:tcW w:type="dxa" w:w="9638"/>
+            <w:tcBorders>
+              <w:top w:val="dashed" w:color="808080" w:sz="6"/>
+              <w:left w:val="dashed" w:color="808080" w:sz="6"/>
+              <w:bottom w:val="dashed" w:color="808080" w:sz="6"/>
+              <w:right w:val="dashed" w:color="808080" w:sz="6"/>
+            </w:tcBorders>
+            <w:tcMar>
+              <w:top w:type="dxa" w:w="80"/>
+              <w:left w:type="dxa" w:w="90"/>
+              <w:bottom w:type="dxa" w:w="80"/>
+              <w:right w:type="dxa" w:w="90"/>
+            </w:tcMar>
+            <w:vAlign w:val="center"/>
+          </w:tcPr>
+          <w:p>
+            <w:pPr>
+              <w:spacing w:after="0"/>
+              <w:jc w:val="center"/>
+            </w:pPr>
+            <w:r>
+              <w:rPr>
+                <w:i/>
+                <w:iCs/>
+                <w:color w:val="5A6672"/>
+                <w:sz w:val="20"/>
+                <w:szCs w:val="20"/>
+              </w:rPr>
+              <w:t xml:space="preserve">Pegue aquí la captura de pantalla de la salida de la salida de R1 en su notebook.</w:t>
+            </w:r>
+          </w:p>
+        </w:tc>
+      </w:tr>
+    </w:tbl>
+    <w:p>
+      <w:pPr>
+        <w:keepNext/>
+        <w:spacing w:after="40" w:before="160"/>
+      </w:pPr>
+      <w:r>
+        <w:rPr>
+          <w:b/>
+          <w:bCs/>
+        </w:rPr>
+        <w:t xml:space="preserve">Resultado e interpretación:</w:t>
+      </w:r>
+    </w:p>
+    <w:p>
+      <w:pPr>
+        <w:spacing w:after="0" w:before="40"/>
+      </w:pPr>
+      <w:r>
+        <w:t xml:space="preserve">______________________________________________________________________</w:t>
+      </w:r>
+    </w:p>
+    <w:p>
+      <w:pPr>
+        <w:spacing w:after="200" w:before="40"/>
+      </w:pPr>
+      <w:r>
+        <w:t xml:space="preserve">______________________________________________________________________</w:t>
       </w:r>
     </w:p>
     <w:p>
@@ -3741,20 +3993,89 @@
         <w:t xml:space="preserve">  [(12, 324.0)]</w:t>
       </w:r>
     </w:p>
-    <w:p>
-      <w:pPr>
-        <w:spacing w:after="0" w:before="80"/>
-      </w:pPr>
-      <w:r>
-        <w:t xml:space="preserve">Interpretación: ________________________________________________</w:t>
-      </w:r>
-    </w:p>
-    <w:p>
-      <w:pPr>
-        <w:spacing w:after="240" w:before="80"/>
-      </w:pPr>
-      <w:r>
-        <w:t xml:space="preserve">________________________________________________________________</w:t>
+    <w:tbl>
+      <w:tblPr>
+        <w:tblW w:type="dxa" w:w="9638"/>
+        <w:tblBorders>
+          <w:top w:val="single" w:color="auto" w:sz="4"/>
+          <w:left w:val="single" w:color="auto" w:sz="4"/>
+          <w:bottom w:val="single" w:color="auto" w:sz="4"/>
+          <w:right w:val="single" w:color="auto" w:sz="4"/>
+          <w:insideH w:val="single" w:color="auto" w:sz="4"/>
+          <w:insideV w:val="single" w:color="auto" w:sz="4"/>
+        </w:tblBorders>
+      </w:tblPr>
+      <w:tblGrid>
+        <w:gridCol w:w="9638"/>
+      </w:tblGrid>
+      <w:tr>
+        <w:trPr>
+          <w:cantSplit/>
+          <w:trHeight w:val="1800" w:hRule="atLeast"/>
+        </w:trPr>
+        <w:tc>
+          <w:tcPr>
+            <w:tcW w:type="dxa" w:w="9638"/>
+            <w:tcBorders>
+              <w:top w:val="dashed" w:color="808080" w:sz="6"/>
+              <w:left w:val="dashed" w:color="808080" w:sz="6"/>
+              <w:bottom w:val="dashed" w:color="808080" w:sz="6"/>
+              <w:right w:val="dashed" w:color="808080" w:sz="6"/>
+            </w:tcBorders>
+            <w:tcMar>
+              <w:top w:type="dxa" w:w="80"/>
+              <w:left w:type="dxa" w:w="90"/>
+              <w:bottom w:type="dxa" w:w="80"/>
+              <w:right w:type="dxa" w:w="90"/>
+            </w:tcMar>
+            <w:vAlign w:val="center"/>
+          </w:tcPr>
+          <w:p>
+            <w:pPr>
+              <w:spacing w:after="0"/>
+              <w:jc w:val="center"/>
+            </w:pPr>
+            <w:r>
+              <w:rPr>
+                <w:i/>
+                <w:iCs/>
+                <w:color w:val="5A6672"/>
+                <w:sz w:val="20"/>
+                <w:szCs w:val="20"/>
+              </w:rPr>
+              <w:t xml:space="preserve">Pegue aquí la captura de pantalla de la salida de la salida de R2 en su notebook.</w:t>
+            </w:r>
+          </w:p>
+        </w:tc>
+      </w:tr>
+    </w:tbl>
+    <w:p>
+      <w:pPr>
+        <w:keepNext/>
+        <w:spacing w:after="40" w:before="160"/>
+      </w:pPr>
+      <w:r>
+        <w:rPr>
+          <w:b/>
+          <w:bCs/>
+        </w:rPr>
+        <w:t xml:space="preserve">Resultado e interpretación:</w:t>
+      </w:r>
+    </w:p>
+    <w:p>
+      <w:pPr>
+        <w:spacing w:after="0" w:before="40"/>
+      </w:pPr>
+      <w:r>
+        <w:t xml:space="preserve">______________________________________________________________________</w:t>
+      </w:r>
+    </w:p>
+    <w:p>
+      <w:pPr>
+        <w:spacing w:after="200" w:before="40"/>
+      </w:pPr>
+      <w:r>
+        <w:t xml:space="preserve">______________________________________________________________________</w:t>
       </w:r>
     </w:p>
     <w:p>
@@ -3869,20 +4190,89 @@
         <w:t xml:space="preserve">  [(18, 847.0, 47.06)]</w:t>
       </w:r>
     </w:p>
-    <w:p>
-      <w:pPr>
-        <w:spacing w:after="0" w:before="80"/>
-      </w:pPr>
-      <w:r>
-        <w:t xml:space="preserve">Interpretación: ________________________________________________</w:t>
-      </w:r>
-    </w:p>
-    <w:p>
-      <w:pPr>
-        <w:spacing w:after="240" w:before="80"/>
-      </w:pPr>
-      <w:r>
-        <w:t xml:space="preserve">________________________________________________________________</w:t>
+    <w:tbl>
+      <w:tblPr>
+        <w:tblW w:type="dxa" w:w="9638"/>
+        <w:tblBorders>
+          <w:top w:val="single" w:color="auto" w:sz="4"/>
+          <w:left w:val="single" w:color="auto" w:sz="4"/>
+          <w:bottom w:val="single" w:color="auto" w:sz="4"/>
+          <w:right w:val="single" w:color="auto" w:sz="4"/>
+          <w:insideH w:val="single" w:color="auto" w:sz="4"/>
+          <w:insideV w:val="single" w:color="auto" w:sz="4"/>
+        </w:tblBorders>
+      </w:tblPr>
+      <w:tblGrid>
+        <w:gridCol w:w="9638"/>
+      </w:tblGrid>
+      <w:tr>
+        <w:trPr>
+          <w:cantSplit/>
+          <w:trHeight w:val="1800" w:hRule="atLeast"/>
+        </w:trPr>
+        <w:tc>
+          <w:tcPr>
+            <w:tcW w:type="dxa" w:w="9638"/>
+            <w:tcBorders>
+              <w:top w:val="dashed" w:color="808080" w:sz="6"/>
+              <w:left w:val="dashed" w:color="808080" w:sz="6"/>
+              <w:bottom w:val="dashed" w:color="808080" w:sz="6"/>
+              <w:right w:val="dashed" w:color="808080" w:sz="6"/>
+            </w:tcBorders>
+            <w:tcMar>
+              <w:top w:type="dxa" w:w="80"/>
+              <w:left w:type="dxa" w:w="90"/>
+              <w:bottom w:type="dxa" w:w="80"/>
+              <w:right w:type="dxa" w:w="90"/>
+            </w:tcMar>
+            <w:vAlign w:val="center"/>
+          </w:tcPr>
+          <w:p>
+            <w:pPr>
+              <w:spacing w:after="0"/>
+              <w:jc w:val="center"/>
+            </w:pPr>
+            <w:r>
+              <w:rPr>
+                <w:i/>
+                <w:iCs/>
+                <w:color w:val="5A6672"/>
+                <w:sz w:val="20"/>
+                <w:szCs w:val="20"/>
+              </w:rPr>
+              <w:t xml:space="preserve">Pegue aquí la captura de pantalla de la salida de la salida de R3 en su notebook.</w:t>
+            </w:r>
+          </w:p>
+        </w:tc>
+      </w:tr>
+    </w:tbl>
+    <w:p>
+      <w:pPr>
+        <w:keepNext/>
+        <w:spacing w:after="40" w:before="160"/>
+      </w:pPr>
+      <w:r>
+        <w:rPr>
+          <w:b/>
+          <w:bCs/>
+        </w:rPr>
+        <w:t xml:space="preserve">Resultado e interpretación:</w:t>
+      </w:r>
+    </w:p>
+    <w:p>
+      <w:pPr>
+        <w:spacing w:after="0" w:before="40"/>
+      </w:pPr>
+      <w:r>
+        <w:t xml:space="preserve">______________________________________________________________________</w:t>
+      </w:r>
+    </w:p>
+    <w:p>
+      <w:pPr>
+        <w:spacing w:after="200" w:before="40"/>
+      </w:pPr>
+      <w:r>
+        <w:t xml:space="preserve">______________________________________________________________________</w:t>
       </w:r>
     </w:p>
     <w:p>

</xml_diff>

<commit_message>
Calificado 1: simplificar (sin capturas, sin funciones/for, solo SELECT/WHERE/ORDER BY/LIMIT), variables en español, SQLite
Co-Authored-By: Claude Sonnet 5.5 <noreply@anthropic.com>
Claude-Session: https://claude.ai/code/session_01HWf88gfjbnyHET9WH8GMM1
</commit_message>
<xml_diff>
--- a/laboratorios_fgd/LAB-D2-FGD-2026II-DOCENTE-RESUELTO.docx
+++ b/laboratorios_fgd/LAB-D2-FGD-2026II-DOCENTE-RESUELTO.docx
@@ -55,7 +55,7 @@
         <w:t xml:space="preserve">Tema:</w:t>
       </w:r>
       <w:r>
-        <w:t xml:space="preserve"> Consultas SQL para decisiones comerciales en El Buen Sabor</w:t>
+        <w:t xml:space="preserve"> Consultas SQLite para decisiones comerciales en El Buen Sabor</w:t>
       </w:r>
     </w:p>
     <w:p>
@@ -388,7 +388,7 @@
         <w:jc w:val="both"/>
       </w:pPr>
       <w:r>
-        <w:t xml:space="preserve">Formula y ejecuta consultas SQL básicas sobre datos de ventas; selecciona columnas, filtra, ordena y resume registros, e interpreta cada resultado para responder una pregunta comercial.</w:t>
+        <w:t xml:space="preserve">Formula y ejecuta consultas SQLite básicas sobre datos de ventas; selecciona columnas, filtra, ordena y resume registros, e interpreta cada resultado para responder una pregunta comercial.</w:t>
       </w:r>
     </w:p>
     <w:p>
@@ -1958,7 +1958,7 @@
     </w:p>
     <w:p>
       <w:pPr>
-        <w:spacing w:after="160" w:before="40"/>
+        <w:spacing w:after="240" w:before="40"/>
       </w:pPr>
       <w:r>
         <w:t xml:space="preserve">¿Qué cláusula fue decisiva y qué permite concluir este resultado? ____________________</w:t>
@@ -2086,7 +2086,7 @@
     </w:p>
     <w:p>
       <w:pPr>
-        <w:spacing w:after="160" w:before="40"/>
+        <w:spacing w:after="240" w:before="40"/>
       </w:pPr>
       <w:r>
         <w:t xml:space="preserve">¿Qué cláusula fue decisiva y qué permite concluir este resultado? ____________________</w:t>
@@ -2214,7 +2214,7 @@
     </w:p>
     <w:p>
       <w:pPr>
-        <w:spacing w:after="160" w:before="40"/>
+        <w:spacing w:after="240" w:before="40"/>
       </w:pPr>
       <w:r>
         <w:t xml:space="preserve">¿Qué cláusula fue decisiva y qué permite concluir este resultado? ____________________</w:t>
@@ -2342,72 +2342,11 @@
     </w:p>
     <w:p>
       <w:pPr>
-        <w:spacing w:after="160" w:before="40"/>
+        <w:spacing w:after="240" w:before="40"/>
       </w:pPr>
       <w:r>
         <w:t xml:space="preserve">¿Qué cláusula fue decisiva y qué permite concluir este resultado? ____________________</w:t>
       </w:r>
-    </w:p>
-    <w:tbl>
-      <w:tblPr>
-        <w:tblW w:type="dxa" w:w="9638"/>
-        <w:tblBorders>
-          <w:top w:val="single" w:color="auto" w:sz="4"/>
-          <w:left w:val="single" w:color="auto" w:sz="4"/>
-          <w:bottom w:val="single" w:color="auto" w:sz="4"/>
-          <w:right w:val="single" w:color="auto" w:sz="4"/>
-          <w:insideH w:val="single" w:color="auto" w:sz="4"/>
-          <w:insideV w:val="single" w:color="auto" w:sz="4"/>
-        </w:tblBorders>
-      </w:tblPr>
-      <w:tblGrid>
-        <w:gridCol w:w="9638"/>
-      </w:tblGrid>
-      <w:tr>
-        <w:trPr>
-          <w:cantSplit/>
-          <w:trHeight w:val="1800" w:hRule="atLeast"/>
-        </w:trPr>
-        <w:tc>
-          <w:tcPr>
-            <w:tcW w:type="dxa" w:w="9638"/>
-            <w:tcBorders>
-              <w:top w:val="dashed" w:color="808080" w:sz="6"/>
-              <w:left w:val="dashed" w:color="808080" w:sz="6"/>
-              <w:bottom w:val="dashed" w:color="808080" w:sz="6"/>
-              <w:right w:val="dashed" w:color="808080" w:sz="6"/>
-            </w:tcBorders>
-            <w:tcMar>
-              <w:top w:type="dxa" w:w="80"/>
-              <w:left w:type="dxa" w:w="90"/>
-              <w:bottom w:type="dxa" w:w="80"/>
-              <w:right w:type="dxa" w:w="90"/>
-            </w:tcMar>
-            <w:vAlign w:val="center"/>
-          </w:tcPr>
-          <w:p>
-            <w:pPr>
-              <w:spacing w:after="0"/>
-              <w:jc w:val="center"/>
-            </w:pPr>
-            <w:r>
-              <w:rPr>
-                <w:i/>
-                <w:iCs/>
-                <w:color w:val="5A6672"/>
-                <w:sz w:val="20"/>
-                <w:szCs w:val="20"/>
-              </w:rPr>
-              <w:t xml:space="preserve">Pegue aquí la captura de pantalla de la salida de la salida de P1 — Ahora participa el estudiante en su notebook.</w:t>
-            </w:r>
-          </w:p>
-        </w:tc>
-      </w:tr>
-    </w:tbl>
-    <w:p>
-      <w:pPr>
-        <w:spacing w:after="160"/>
-      </w:pPr>
     </w:p>
     <w:p>
       <w:pPr>
@@ -2546,7 +2485,7 @@
     </w:p>
     <w:p>
       <w:pPr>
-        <w:spacing w:after="160" w:before="40"/>
+        <w:spacing w:after="240" w:before="40"/>
       </w:pPr>
       <w:r>
         <w:t xml:space="preserve">¿Qué cláusula fue decisiva y qué permite concluir este resultado? ____________________</w:t>
@@ -2689,7 +2628,7 @@
     </w:p>
     <w:p>
       <w:pPr>
-        <w:spacing w:after="160" w:before="40"/>
+        <w:spacing w:after="240" w:before="40"/>
       </w:pPr>
       <w:r>
         <w:t xml:space="preserve">¿Qué cláusula fue decisiva y qué permite concluir este resultado? ____________________</w:t>
@@ -2832,7 +2771,7 @@
     </w:p>
     <w:p>
       <w:pPr>
-        <w:spacing w:after="160" w:before="40"/>
+        <w:spacing w:after="240" w:before="40"/>
       </w:pPr>
       <w:r>
         <w:t xml:space="preserve">¿Qué cláusula fue decisiva y qué permite concluir este resultado? ____________________</w:t>
@@ -2990,72 +2929,11 @@
     </w:p>
     <w:p>
       <w:pPr>
-        <w:spacing w:after="160" w:before="40"/>
+        <w:spacing w:after="240" w:before="40"/>
       </w:pPr>
       <w:r>
         <w:t xml:space="preserve">¿Qué cláusula fue decisiva y qué permite concluir este resultado? ____________________</w:t>
       </w:r>
-    </w:p>
-    <w:tbl>
-      <w:tblPr>
-        <w:tblW w:type="dxa" w:w="9638"/>
-        <w:tblBorders>
-          <w:top w:val="single" w:color="auto" w:sz="4"/>
-          <w:left w:val="single" w:color="auto" w:sz="4"/>
-          <w:bottom w:val="single" w:color="auto" w:sz="4"/>
-          <w:right w:val="single" w:color="auto" w:sz="4"/>
-          <w:insideH w:val="single" w:color="auto" w:sz="4"/>
-          <w:insideV w:val="single" w:color="auto" w:sz="4"/>
-        </w:tblBorders>
-      </w:tblPr>
-      <w:tblGrid>
-        <w:gridCol w:w="9638"/>
-      </w:tblGrid>
-      <w:tr>
-        <w:trPr>
-          <w:cantSplit/>
-          <w:trHeight w:val="1800" w:hRule="atLeast"/>
-        </w:trPr>
-        <w:tc>
-          <w:tcPr>
-            <w:tcW w:type="dxa" w:w="9638"/>
-            <w:tcBorders>
-              <w:top w:val="dashed" w:color="808080" w:sz="6"/>
-              <w:left w:val="dashed" w:color="808080" w:sz="6"/>
-              <w:bottom w:val="dashed" w:color="808080" w:sz="6"/>
-              <w:right w:val="dashed" w:color="808080" w:sz="6"/>
-            </w:tcBorders>
-            <w:tcMar>
-              <w:top w:type="dxa" w:w="80"/>
-              <w:left w:type="dxa" w:w="90"/>
-              <w:bottom w:type="dxa" w:w="80"/>
-              <w:right w:type="dxa" w:w="90"/>
-            </w:tcMar>
-            <w:vAlign w:val="center"/>
-          </w:tcPr>
-          <w:p>
-            <w:pPr>
-              <w:spacing w:after="0"/>
-              <w:jc w:val="center"/>
-            </w:pPr>
-            <w:r>
-              <w:rPr>
-                <w:i/>
-                <w:iCs/>
-                <w:color w:val="5A6672"/>
-                <w:sz w:val="20"/>
-                <w:szCs w:val="20"/>
-              </w:rPr>
-              <w:t xml:space="preserve">Pegue aquí la captura de pantalla de la salida de la salida de P2 — Ahora participa el estudiante en su notebook.</w:t>
-            </w:r>
-          </w:p>
-        </w:tc>
-      </w:tr>
-    </w:tbl>
-    <w:p>
-      <w:pPr>
-        <w:spacing w:after="160"/>
-      </w:pPr>
     </w:p>
     <w:p>
       <w:pPr>
@@ -3194,7 +3072,7 @@
     </w:p>
     <w:p>
       <w:pPr>
-        <w:spacing w:after="160" w:before="40"/>
+        <w:spacing w:after="240" w:before="40"/>
       </w:pPr>
       <w:r>
         <w:t xml:space="preserve">¿Qué cláusula fue decisiva y qué permite concluir este resultado? ____________________</w:t>
@@ -3322,7 +3200,7 @@
     </w:p>
     <w:p>
       <w:pPr>
-        <w:spacing w:after="160" w:before="40"/>
+        <w:spacing w:after="240" w:before="40"/>
       </w:pPr>
       <w:r>
         <w:t xml:space="preserve">¿Qué cláusula fue decisiva y qué permite concluir este resultado? ____________________</w:t>
@@ -3435,7 +3313,7 @@
     </w:p>
     <w:p>
       <w:pPr>
-        <w:spacing w:after="160" w:before="40"/>
+        <w:spacing w:after="240" w:before="40"/>
       </w:pPr>
       <w:r>
         <w:t xml:space="preserve">¿Qué cláusula fue decisiva y qué permite concluir este resultado? ____________________</w:t>
@@ -3563,72 +3441,11 @@
     </w:p>
     <w:p>
       <w:pPr>
-        <w:spacing w:after="160" w:before="40"/>
+        <w:spacing w:after="240" w:before="40"/>
       </w:pPr>
       <w:r>
         <w:t xml:space="preserve">¿Qué cláusula fue decisiva y qué permite concluir este resultado? ____________________</w:t>
       </w:r>
-    </w:p>
-    <w:tbl>
-      <w:tblPr>
-        <w:tblW w:type="dxa" w:w="9638"/>
-        <w:tblBorders>
-          <w:top w:val="single" w:color="auto" w:sz="4"/>
-          <w:left w:val="single" w:color="auto" w:sz="4"/>
-          <w:bottom w:val="single" w:color="auto" w:sz="4"/>
-          <w:right w:val="single" w:color="auto" w:sz="4"/>
-          <w:insideH w:val="single" w:color="auto" w:sz="4"/>
-          <w:insideV w:val="single" w:color="auto" w:sz="4"/>
-        </w:tblBorders>
-      </w:tblPr>
-      <w:tblGrid>
-        <w:gridCol w:w="9638"/>
-      </w:tblGrid>
-      <w:tr>
-        <w:trPr>
-          <w:cantSplit/>
-          <w:trHeight w:val="1800" w:hRule="atLeast"/>
-        </w:trPr>
-        <w:tc>
-          <w:tcPr>
-            <w:tcW w:type="dxa" w:w="9638"/>
-            <w:tcBorders>
-              <w:top w:val="dashed" w:color="808080" w:sz="6"/>
-              <w:left w:val="dashed" w:color="808080" w:sz="6"/>
-              <w:bottom w:val="dashed" w:color="808080" w:sz="6"/>
-              <w:right w:val="dashed" w:color="808080" w:sz="6"/>
-            </w:tcBorders>
-            <w:tcMar>
-              <w:top w:type="dxa" w:w="80"/>
-              <w:left w:type="dxa" w:w="90"/>
-              <w:bottom w:type="dxa" w:w="80"/>
-              <w:right w:type="dxa" w:w="90"/>
-            </w:tcMar>
-            <w:vAlign w:val="center"/>
-          </w:tcPr>
-          <w:p>
-            <w:pPr>
-              <w:spacing w:after="0"/>
-              <w:jc w:val="center"/>
-            </w:pPr>
-            <w:r>
-              <w:rPr>
-                <w:i/>
-                <w:iCs/>
-                <w:color w:val="5A6672"/>
-                <w:sz w:val="20"/>
-                <w:szCs w:val="20"/>
-              </w:rPr>
-              <w:t xml:space="preserve">Pegue aquí la captura de pantalla de la salida de la salida de P3 — Ahora participa el estudiante en su notebook.</w:t>
-            </w:r>
-          </w:p>
-        </w:tc>
-      </w:tr>
-    </w:tbl>
-    <w:p>
-      <w:pPr>
-        <w:spacing w:after="160"/>
-      </w:pPr>
     </w:p>
     <w:p>
       <w:pPr>
@@ -3796,89 +3613,20 @@
         <w:t xml:space="preserve">  [('Pollo a la plancha', 3, 99.0), ('Ceviche', 2, 84.0), ('Pollo a la plancha', 2, 66.0)]</w:t>
       </w:r>
     </w:p>
-    <w:tbl>
-      <w:tblPr>
-        <w:tblW w:type="dxa" w:w="9638"/>
-        <w:tblBorders>
-          <w:top w:val="single" w:color="auto" w:sz="4"/>
-          <w:left w:val="single" w:color="auto" w:sz="4"/>
-          <w:bottom w:val="single" w:color="auto" w:sz="4"/>
-          <w:right w:val="single" w:color="auto" w:sz="4"/>
-          <w:insideH w:val="single" w:color="auto" w:sz="4"/>
-          <w:insideV w:val="single" w:color="auto" w:sz="4"/>
-        </w:tblBorders>
-      </w:tblPr>
-      <w:tblGrid>
-        <w:gridCol w:w="9638"/>
-      </w:tblGrid>
-      <w:tr>
-        <w:trPr>
-          <w:cantSplit/>
-          <w:trHeight w:val="1800" w:hRule="atLeast"/>
-        </w:trPr>
-        <w:tc>
-          <w:tcPr>
-            <w:tcW w:type="dxa" w:w="9638"/>
-            <w:tcBorders>
-              <w:top w:val="dashed" w:color="808080" w:sz="6"/>
-              <w:left w:val="dashed" w:color="808080" w:sz="6"/>
-              <w:bottom w:val="dashed" w:color="808080" w:sz="6"/>
-              <w:right w:val="dashed" w:color="808080" w:sz="6"/>
-            </w:tcBorders>
-            <w:tcMar>
-              <w:top w:type="dxa" w:w="80"/>
-              <w:left w:type="dxa" w:w="90"/>
-              <w:bottom w:type="dxa" w:w="80"/>
-              <w:right w:type="dxa" w:w="90"/>
-            </w:tcMar>
-            <w:vAlign w:val="center"/>
-          </w:tcPr>
-          <w:p>
-            <w:pPr>
-              <w:spacing w:after="0"/>
-              <w:jc w:val="center"/>
-            </w:pPr>
-            <w:r>
-              <w:rPr>
-                <w:i/>
-                <w:iCs/>
-                <w:color w:val="5A6672"/>
-                <w:sz w:val="20"/>
-                <w:szCs w:val="20"/>
-              </w:rPr>
-              <w:t xml:space="preserve">Pegue aquí la captura de pantalla de la salida de la salida de R1 en su notebook.</w:t>
-            </w:r>
-          </w:p>
-        </w:tc>
-      </w:tr>
-    </w:tbl>
-    <w:p>
-      <w:pPr>
-        <w:keepNext/>
-        <w:spacing w:after="40" w:before="160"/>
-      </w:pPr>
-      <w:r>
-        <w:rPr>
-          <w:b/>
-          <w:bCs/>
-        </w:rPr>
-        <w:t xml:space="preserve">Resultado e interpretación:</w:t>
-      </w:r>
-    </w:p>
-    <w:p>
-      <w:pPr>
-        <w:spacing w:after="0" w:before="40"/>
-      </w:pPr>
-      <w:r>
-        <w:t xml:space="preserve">______________________________________________________________________</w:t>
-      </w:r>
-    </w:p>
-    <w:p>
-      <w:pPr>
-        <w:spacing w:after="200" w:before="40"/>
-      </w:pPr>
-      <w:r>
-        <w:t xml:space="preserve">______________________________________________________________________</w:t>
+    <w:p>
+      <w:pPr>
+        <w:spacing w:after="0" w:before="80"/>
+      </w:pPr>
+      <w:r>
+        <w:t xml:space="preserve">Interpretación: ________________________________________________</w:t>
+      </w:r>
+    </w:p>
+    <w:p>
+      <w:pPr>
+        <w:spacing w:after="240" w:before="80"/>
+      </w:pPr>
+      <w:r>
+        <w:t xml:space="preserve">________________________________________________________________</w:t>
       </w:r>
     </w:p>
     <w:p>
@@ -3993,89 +3741,20 @@
         <w:t xml:space="preserve">  [(12, 324.0)]</w:t>
       </w:r>
     </w:p>
-    <w:tbl>
-      <w:tblPr>
-        <w:tblW w:type="dxa" w:w="9638"/>
-        <w:tblBorders>
-          <w:top w:val="single" w:color="auto" w:sz="4"/>
-          <w:left w:val="single" w:color="auto" w:sz="4"/>
-          <w:bottom w:val="single" w:color="auto" w:sz="4"/>
-          <w:right w:val="single" w:color="auto" w:sz="4"/>
-          <w:insideH w:val="single" w:color="auto" w:sz="4"/>
-          <w:insideV w:val="single" w:color="auto" w:sz="4"/>
-        </w:tblBorders>
-      </w:tblPr>
-      <w:tblGrid>
-        <w:gridCol w:w="9638"/>
-      </w:tblGrid>
-      <w:tr>
-        <w:trPr>
-          <w:cantSplit/>
-          <w:trHeight w:val="1800" w:hRule="atLeast"/>
-        </w:trPr>
-        <w:tc>
-          <w:tcPr>
-            <w:tcW w:type="dxa" w:w="9638"/>
-            <w:tcBorders>
-              <w:top w:val="dashed" w:color="808080" w:sz="6"/>
-              <w:left w:val="dashed" w:color="808080" w:sz="6"/>
-              <w:bottom w:val="dashed" w:color="808080" w:sz="6"/>
-              <w:right w:val="dashed" w:color="808080" w:sz="6"/>
-            </w:tcBorders>
-            <w:tcMar>
-              <w:top w:type="dxa" w:w="80"/>
-              <w:left w:type="dxa" w:w="90"/>
-              <w:bottom w:type="dxa" w:w="80"/>
-              <w:right w:type="dxa" w:w="90"/>
-            </w:tcMar>
-            <w:vAlign w:val="center"/>
-          </w:tcPr>
-          <w:p>
-            <w:pPr>
-              <w:spacing w:after="0"/>
-              <w:jc w:val="center"/>
-            </w:pPr>
-            <w:r>
-              <w:rPr>
-                <w:i/>
-                <w:iCs/>
-                <w:color w:val="5A6672"/>
-                <w:sz w:val="20"/>
-                <w:szCs w:val="20"/>
-              </w:rPr>
-              <w:t xml:space="preserve">Pegue aquí la captura de pantalla de la salida de la salida de R2 en su notebook.</w:t>
-            </w:r>
-          </w:p>
-        </w:tc>
-      </w:tr>
-    </w:tbl>
-    <w:p>
-      <w:pPr>
-        <w:keepNext/>
-        <w:spacing w:after="40" w:before="160"/>
-      </w:pPr>
-      <w:r>
-        <w:rPr>
-          <w:b/>
-          <w:bCs/>
-        </w:rPr>
-        <w:t xml:space="preserve">Resultado e interpretación:</w:t>
-      </w:r>
-    </w:p>
-    <w:p>
-      <w:pPr>
-        <w:spacing w:after="0" w:before="40"/>
-      </w:pPr>
-      <w:r>
-        <w:t xml:space="preserve">______________________________________________________________________</w:t>
-      </w:r>
-    </w:p>
-    <w:p>
-      <w:pPr>
-        <w:spacing w:after="200" w:before="40"/>
-      </w:pPr>
-      <w:r>
-        <w:t xml:space="preserve">______________________________________________________________________</w:t>
+    <w:p>
+      <w:pPr>
+        <w:spacing w:after="0" w:before="80"/>
+      </w:pPr>
+      <w:r>
+        <w:t xml:space="preserve">Interpretación: ________________________________________________</w:t>
+      </w:r>
+    </w:p>
+    <w:p>
+      <w:pPr>
+        <w:spacing w:after="240" w:before="80"/>
+      </w:pPr>
+      <w:r>
+        <w:t xml:space="preserve">________________________________________________________________</w:t>
       </w:r>
     </w:p>
     <w:p>
@@ -4190,89 +3869,20 @@
         <w:t xml:space="preserve">  [(18, 847.0, 47.06)]</w:t>
       </w:r>
     </w:p>
-    <w:tbl>
-      <w:tblPr>
-        <w:tblW w:type="dxa" w:w="9638"/>
-        <w:tblBorders>
-          <w:top w:val="single" w:color="auto" w:sz="4"/>
-          <w:left w:val="single" w:color="auto" w:sz="4"/>
-          <w:bottom w:val="single" w:color="auto" w:sz="4"/>
-          <w:right w:val="single" w:color="auto" w:sz="4"/>
-          <w:insideH w:val="single" w:color="auto" w:sz="4"/>
-          <w:insideV w:val="single" w:color="auto" w:sz="4"/>
-        </w:tblBorders>
-      </w:tblPr>
-      <w:tblGrid>
-        <w:gridCol w:w="9638"/>
-      </w:tblGrid>
-      <w:tr>
-        <w:trPr>
-          <w:cantSplit/>
-          <w:trHeight w:val="1800" w:hRule="atLeast"/>
-        </w:trPr>
-        <w:tc>
-          <w:tcPr>
-            <w:tcW w:type="dxa" w:w="9638"/>
-            <w:tcBorders>
-              <w:top w:val="dashed" w:color="808080" w:sz="6"/>
-              <w:left w:val="dashed" w:color="808080" w:sz="6"/>
-              <w:bottom w:val="dashed" w:color="808080" w:sz="6"/>
-              <w:right w:val="dashed" w:color="808080" w:sz="6"/>
-            </w:tcBorders>
-            <w:tcMar>
-              <w:top w:type="dxa" w:w="80"/>
-              <w:left w:type="dxa" w:w="90"/>
-              <w:bottom w:type="dxa" w:w="80"/>
-              <w:right w:type="dxa" w:w="90"/>
-            </w:tcMar>
-            <w:vAlign w:val="center"/>
-          </w:tcPr>
-          <w:p>
-            <w:pPr>
-              <w:spacing w:after="0"/>
-              <w:jc w:val="center"/>
-            </w:pPr>
-            <w:r>
-              <w:rPr>
-                <w:i/>
-                <w:iCs/>
-                <w:color w:val="5A6672"/>
-                <w:sz w:val="20"/>
-                <w:szCs w:val="20"/>
-              </w:rPr>
-              <w:t xml:space="preserve">Pegue aquí la captura de pantalla de la salida de la salida de R3 en su notebook.</w:t>
-            </w:r>
-          </w:p>
-        </w:tc>
-      </w:tr>
-    </w:tbl>
-    <w:p>
-      <w:pPr>
-        <w:keepNext/>
-        <w:spacing w:after="40" w:before="160"/>
-      </w:pPr>
-      <w:r>
-        <w:rPr>
-          <w:b/>
-          <w:bCs/>
-        </w:rPr>
-        <w:t xml:space="preserve">Resultado e interpretación:</w:t>
-      </w:r>
-    </w:p>
-    <w:p>
-      <w:pPr>
-        <w:spacing w:after="0" w:before="40"/>
-      </w:pPr>
-      <w:r>
-        <w:t xml:space="preserve">______________________________________________________________________</w:t>
-      </w:r>
-    </w:p>
-    <w:p>
-      <w:pPr>
-        <w:spacing w:after="200" w:before="40"/>
-      </w:pPr>
-      <w:r>
-        <w:t xml:space="preserve">______________________________________________________________________</w:t>
+    <w:p>
+      <w:pPr>
+        <w:spacing w:after="0" w:before="80"/>
+      </w:pPr>
+      <w:r>
+        <w:t xml:space="preserve">Interpretación: ________________________________________________</w:t>
+      </w:r>
+    </w:p>
+    <w:p>
+      <w:pPr>
+        <w:spacing w:after="240" w:before="80"/>
+      </w:pPr>
+      <w:r>
+        <w:t xml:space="preserve">________________________________________________________________</w:t>
       </w:r>
     </w:p>
     <w:p>
@@ -4371,7 +3981,7 @@
         <w:t xml:space="preserve">Elemento de la capacidad:</w:t>
       </w:r>
       <w:r>
-        <w:t xml:space="preserve"> formula y ejecuta consultas SQL básicas e interpreta cada resultado para responder una pregunta comercial.</w:t>
+        <w:t xml:space="preserve"> formula y ejecuta consultas SQLite básicas e interpreta cada resultado para responder una pregunta comercial.</w:t>
       </w:r>
     </w:p>
     <w:tbl>

</xml_diff>

<commit_message>
Calificado 1 alineado al sílabo: sin código de autos ni metadatos, funciones de resumen en cada consulta; Dirigido 2 a 100 min
Co-Authored-By: Claude Sonnet 5.5 <noreply@anthropic.com>
Claude-Session: https://claude.ai/code/session_01HWf88gfjbnyHET9WH8GMM1
</commit_message>
<xml_diff>
--- a/laboratorios_fgd/LAB-D2-FGD-2026II-DOCENTE-RESUELTO.docx
+++ b/laboratorios_fgd/LAB-D2-FGD-2026II-DOCENTE-RESUELTO.docx
@@ -815,9 +815,9 @@
         </w:tblBorders>
       </w:tblPr>
       <w:tblGrid>
-        <w:gridCol w:w="2000"/>
-        <w:gridCol w:w="2000"/>
-        <w:gridCol w:w="5638"/>
+        <w:gridCol w:w="2200"/>
+        <w:gridCol w:w="1500"/>
+        <w:gridCol w:w="5938"/>
       </w:tblGrid>
       <w:tr>
         <w:trPr>
@@ -826,7 +826,7 @@
         </w:trPr>
         <w:tc>
           <w:tcPr>
-            <w:tcW w:type="dxa" w:w="2000"/>
+            <w:tcW w:type="dxa" w:w="2200"/>
             <w:tcBorders>
               <w:top w:val="single" w:color="auto" w:sz="4"/>
               <w:left w:val="single" w:color="auto" w:sz="4"/>
@@ -854,13 +854,13 @@
                 <w:sz w:val="22"/>
                 <w:szCs w:val="22"/>
               </w:rPr>
-              <w:t xml:space="preserve">Sección</w:t>
-            </w:r>
-          </w:p>
-        </w:tc>
-        <w:tc>
-          <w:tcPr>
-            <w:tcW w:type="dxa" w:w="2000"/>
+              <w:t xml:space="preserve">Bloque</w:t>
+            </w:r>
+          </w:p>
+        </w:tc>
+        <w:tc>
+          <w:tcPr>
+            <w:tcW w:type="dxa" w:w="1500"/>
             <w:tcBorders>
               <w:top w:val="single" w:color="auto" w:sz="4"/>
               <w:left w:val="single" w:color="auto" w:sz="4"/>
@@ -888,13 +888,13 @@
                 <w:sz w:val="22"/>
                 <w:szCs w:val="22"/>
               </w:rPr>
-              <w:t xml:space="preserve">Duración</w:t>
-            </w:r>
-          </w:p>
-        </w:tc>
-        <w:tc>
-          <w:tcPr>
-            <w:tcW w:type="dxa" w:w="5638"/>
+              <w:t xml:space="preserve">Tiempo</w:t>
+            </w:r>
+          </w:p>
+        </w:tc>
+        <w:tc>
+          <w:tcPr>
+            <w:tcW w:type="dxa" w:w="5938"/>
             <w:tcBorders>
               <w:top w:val="single" w:color="auto" w:sz="4"/>
               <w:left w:val="single" w:color="auto" w:sz="4"/>
@@ -922,7 +922,7 @@
                 <w:sz w:val="22"/>
                 <w:szCs w:val="22"/>
               </w:rPr>
-              <w:t xml:space="preserve">Distribución</w:t>
+              <w:t xml:space="preserve">Contenido</w:t>
             </w:r>
           </w:p>
         </w:tc>
@@ -933,7 +933,7 @@
         </w:trPr>
         <w:tc>
           <w:tcPr>
-            <w:tcW w:type="dxa" w:w="2000"/>
+            <w:tcW w:type="dxa" w:w="2200"/>
             <w:tcBorders>
               <w:top w:val="single" w:color="auto" w:sz="4"/>
               <w:left w:val="single" w:color="auto" w:sz="4"/>
@@ -960,13 +960,13 @@
                 <w:sz w:val="22"/>
                 <w:szCs w:val="22"/>
               </w:rPr>
-              <w:t xml:space="preserve">Sección A</w:t>
-            </w:r>
-          </w:p>
-        </w:tc>
-        <w:tc>
-          <w:tcPr>
-            <w:tcW w:type="dxa" w:w="2000"/>
+              <w:t xml:space="preserve">Preparación</w:t>
+            </w:r>
+          </w:p>
+        </w:tc>
+        <w:tc>
+          <w:tcPr>
+            <w:tcW w:type="dxa" w:w="1500"/>
             <w:tcBorders>
               <w:top w:val="single" w:color="auto" w:sz="4"/>
               <w:left w:val="single" w:color="auto" w:sz="4"/>
@@ -991,13 +991,13 @@
                 <w:sz w:val="22"/>
                 <w:szCs w:val="22"/>
               </w:rPr>
-              <w:t xml:space="preserve">100 minutos</w:t>
-            </w:r>
-          </w:p>
-        </w:tc>
-        <w:tc>
-          <w:tcPr>
-            <w:tcW w:type="dxa" w:w="5638"/>
+              <w:t xml:space="preserve">10 min</w:t>
+            </w:r>
+          </w:p>
+        </w:tc>
+        <w:tc>
+          <w:tcPr>
+            <w:tcW w:type="dxa" w:w="5938"/>
             <w:tcBorders>
               <w:top w:val="single" w:color="auto" w:sz="4"/>
               <w:left w:val="single" w:color="auto" w:sz="4"/>
@@ -1022,7 +1022,7 @@
                 <w:sz w:val="22"/>
                 <w:szCs w:val="22"/>
               </w:rPr>
-              <w:t xml:space="preserve">Preparación 10 min · tres bloques de 25 min · cierre 15 min.</w:t>
+              <w:t xml:space="preserve">Apertura del caso y ejecución de la celda de preparación.</w:t>
             </w:r>
           </w:p>
         </w:tc>
@@ -1033,7 +1033,7 @@
         </w:trPr>
         <w:tc>
           <w:tcPr>
-            <w:tcW w:type="dxa" w:w="2000"/>
+            <w:tcW w:type="dxa" w:w="2200"/>
             <w:tcBorders>
               <w:top w:val="single" w:color="auto" w:sz="4"/>
               <w:left w:val="single" w:color="auto" w:sz="4"/>
@@ -1060,13 +1060,13 @@
                 <w:sz w:val="22"/>
                 <w:szCs w:val="22"/>
               </w:rPr>
-              <w:t xml:space="preserve">Sección B</w:t>
-            </w:r>
-          </w:p>
-        </w:tc>
-        <w:tc>
-          <w:tcPr>
-            <w:tcW w:type="dxa" w:w="2000"/>
+              <w:t xml:space="preserve">Actividad 1</w:t>
+            </w:r>
+          </w:p>
+        </w:tc>
+        <w:tc>
+          <w:tcPr>
+            <w:tcW w:type="dxa" w:w="1500"/>
             <w:tcBorders>
               <w:top w:val="single" w:color="auto" w:sz="4"/>
               <w:left w:val="single" w:color="auto" w:sz="4"/>
@@ -1091,13 +1091,13 @@
                 <w:sz w:val="22"/>
                 <w:szCs w:val="22"/>
               </w:rPr>
-              <w:t xml:space="preserve">200 minutos</w:t>
-            </w:r>
-          </w:p>
-        </w:tc>
-        <w:tc>
-          <w:tcPr>
-            <w:tcW w:type="dxa" w:w="5638"/>
+              <w:t xml:space="preserve">25 min</w:t>
+            </w:r>
+          </w:p>
+        </w:tc>
+        <w:tc>
+          <w:tcPr>
+            <w:tcW w:type="dxa" w:w="5938"/>
             <w:tcBorders>
               <w:top w:val="single" w:color="auto" w:sz="4"/>
               <w:left w:val="single" w:color="auto" w:sz="4"/>
@@ -1122,7 +1122,407 @@
                 <w:sz w:val="22"/>
                 <w:szCs w:val="22"/>
               </w:rPr>
-              <w:t xml:space="preserve">Más práctica, corrección y discusión de resultados.</w:t>
+              <w:t xml:space="preserve">Explorar y filtrar.</w:t>
+            </w:r>
+          </w:p>
+        </w:tc>
+      </w:tr>
+      <w:tr>
+        <w:trPr>
+          <w:cantSplit/>
+        </w:trPr>
+        <w:tc>
+          <w:tcPr>
+            <w:tcW w:type="dxa" w:w="2200"/>
+            <w:tcBorders>
+              <w:top w:val="single" w:color="auto" w:sz="4"/>
+              <w:left w:val="single" w:color="auto" w:sz="4"/>
+              <w:bottom w:val="single" w:color="auto" w:sz="4"/>
+              <w:right w:val="single" w:color="auto" w:sz="4"/>
+            </w:tcBorders>
+            <w:shd w:fill="F7F9FB" w:color="auto" w:val="clear"/>
+            <w:tcMar>
+              <w:top w:type="dxa" w:w="80"/>
+              <w:left w:type="dxa" w:w="90"/>
+              <w:bottom w:type="dxa" w:w="80"/>
+              <w:right w:type="dxa" w:w="90"/>
+            </w:tcMar>
+            <w:vAlign w:val="top"/>
+          </w:tcPr>
+          <w:p>
+            <w:pPr>
+              <w:spacing w:after="0" w:line="240"/>
+            </w:pPr>
+            <w:r>
+              <w:rPr>
+                <w:b/>
+                <w:bCs/>
+                <w:sz w:val="22"/>
+                <w:szCs w:val="22"/>
+              </w:rPr>
+              <w:t xml:space="preserve">Actividad 2</w:t>
+            </w:r>
+          </w:p>
+        </w:tc>
+        <w:tc>
+          <w:tcPr>
+            <w:tcW w:type="dxa" w:w="1500"/>
+            <w:tcBorders>
+              <w:top w:val="single" w:color="auto" w:sz="4"/>
+              <w:left w:val="single" w:color="auto" w:sz="4"/>
+              <w:bottom w:val="single" w:color="auto" w:sz="4"/>
+              <w:right w:val="single" w:color="auto" w:sz="4"/>
+            </w:tcBorders>
+            <w:shd w:fill="F7F9FB" w:color="auto" w:val="clear"/>
+            <w:tcMar>
+              <w:top w:type="dxa" w:w="80"/>
+              <w:left w:type="dxa" w:w="90"/>
+              <w:bottom w:type="dxa" w:w="80"/>
+              <w:right w:type="dxa" w:w="90"/>
+            </w:tcMar>
+            <w:vAlign w:val="top"/>
+          </w:tcPr>
+          <w:p>
+            <w:pPr>
+              <w:spacing w:after="0" w:line="240"/>
+            </w:pPr>
+            <w:r>
+              <w:rPr>
+                <w:sz w:val="22"/>
+                <w:szCs w:val="22"/>
+              </w:rPr>
+              <w:t xml:space="preserve">25 min</w:t>
+            </w:r>
+          </w:p>
+        </w:tc>
+        <w:tc>
+          <w:tcPr>
+            <w:tcW w:type="dxa" w:w="5938"/>
+            <w:tcBorders>
+              <w:top w:val="single" w:color="auto" w:sz="4"/>
+              <w:left w:val="single" w:color="auto" w:sz="4"/>
+              <w:bottom w:val="single" w:color="auto" w:sz="4"/>
+              <w:right w:val="single" w:color="auto" w:sz="4"/>
+            </w:tcBorders>
+            <w:shd w:fill="F7F9FB" w:color="auto" w:val="clear"/>
+            <w:tcMar>
+              <w:top w:type="dxa" w:w="80"/>
+              <w:left w:type="dxa" w:w="90"/>
+              <w:bottom w:type="dxa" w:w="80"/>
+              <w:right w:type="dxa" w:w="90"/>
+            </w:tcMar>
+            <w:vAlign w:val="top"/>
+          </w:tcPr>
+          <w:p>
+            <w:pPr>
+              <w:spacing w:after="0" w:line="240"/>
+            </w:pPr>
+            <w:r>
+              <w:rPr>
+                <w:sz w:val="22"/>
+                <w:szCs w:val="22"/>
+              </w:rPr>
+              <w:t xml:space="preserve">Alternativas, orden y límite.</w:t>
+            </w:r>
+          </w:p>
+        </w:tc>
+      </w:tr>
+      <w:tr>
+        <w:trPr>
+          <w:cantSplit/>
+        </w:trPr>
+        <w:tc>
+          <w:tcPr>
+            <w:tcW w:type="dxa" w:w="2200"/>
+            <w:tcBorders>
+              <w:top w:val="single" w:color="auto" w:sz="4"/>
+              <w:left w:val="single" w:color="auto" w:sz="4"/>
+              <w:bottom w:val="single" w:color="auto" w:sz="4"/>
+              <w:right w:val="single" w:color="auto" w:sz="4"/>
+            </w:tcBorders>
+            <w:shd w:fill="FFFFFF" w:color="auto" w:val="clear"/>
+            <w:tcMar>
+              <w:top w:type="dxa" w:w="80"/>
+              <w:left w:type="dxa" w:w="90"/>
+              <w:bottom w:type="dxa" w:w="80"/>
+              <w:right w:type="dxa" w:w="90"/>
+            </w:tcMar>
+            <w:vAlign w:val="top"/>
+          </w:tcPr>
+          <w:p>
+            <w:pPr>
+              <w:spacing w:after="0" w:line="240"/>
+            </w:pPr>
+            <w:r>
+              <w:rPr>
+                <w:b/>
+                <w:bCs/>
+                <w:sz w:val="22"/>
+                <w:szCs w:val="22"/>
+              </w:rPr>
+              <w:t xml:space="preserve">Actividad 3</w:t>
+            </w:r>
+          </w:p>
+        </w:tc>
+        <w:tc>
+          <w:tcPr>
+            <w:tcW w:type="dxa" w:w="1500"/>
+            <w:tcBorders>
+              <w:top w:val="single" w:color="auto" w:sz="4"/>
+              <w:left w:val="single" w:color="auto" w:sz="4"/>
+              <w:bottom w:val="single" w:color="auto" w:sz="4"/>
+              <w:right w:val="single" w:color="auto" w:sz="4"/>
+            </w:tcBorders>
+            <w:shd w:fill="FFFFFF" w:color="auto" w:val="clear"/>
+            <w:tcMar>
+              <w:top w:type="dxa" w:w="80"/>
+              <w:left w:type="dxa" w:w="90"/>
+              <w:bottom w:type="dxa" w:w="80"/>
+              <w:right w:type="dxa" w:w="90"/>
+            </w:tcMar>
+            <w:vAlign w:val="top"/>
+          </w:tcPr>
+          <w:p>
+            <w:pPr>
+              <w:spacing w:after="0" w:line="240"/>
+            </w:pPr>
+            <w:r>
+              <w:rPr>
+                <w:sz w:val="22"/>
+                <w:szCs w:val="22"/>
+              </w:rPr>
+              <w:t xml:space="preserve">25 min</w:t>
+            </w:r>
+          </w:p>
+        </w:tc>
+        <w:tc>
+          <w:tcPr>
+            <w:tcW w:type="dxa" w:w="5938"/>
+            <w:tcBorders>
+              <w:top w:val="single" w:color="auto" w:sz="4"/>
+              <w:left w:val="single" w:color="auto" w:sz="4"/>
+              <w:bottom w:val="single" w:color="auto" w:sz="4"/>
+              <w:right w:val="single" w:color="auto" w:sz="4"/>
+            </w:tcBorders>
+            <w:shd w:fill="FFFFFF" w:color="auto" w:val="clear"/>
+            <w:tcMar>
+              <w:top w:type="dxa" w:w="80"/>
+              <w:left w:type="dxa" w:w="90"/>
+              <w:bottom w:type="dxa" w:w="80"/>
+              <w:right w:type="dxa" w:w="90"/>
+            </w:tcMar>
+            <w:vAlign w:val="top"/>
+          </w:tcPr>
+          <w:p>
+            <w:pPr>
+              <w:spacing w:after="0" w:line="240"/>
+            </w:pPr>
+            <w:r>
+              <w:rPr>
+                <w:sz w:val="22"/>
+                <w:szCs w:val="22"/>
+              </w:rPr>
+              <w:t xml:space="preserve">Resumir para decidir.</w:t>
+            </w:r>
+          </w:p>
+        </w:tc>
+      </w:tr>
+      <w:tr>
+        <w:trPr>
+          <w:cantSplit/>
+        </w:trPr>
+        <w:tc>
+          <w:tcPr>
+            <w:tcW w:type="dxa" w:w="2200"/>
+            <w:tcBorders>
+              <w:top w:val="single" w:color="auto" w:sz="4"/>
+              <w:left w:val="single" w:color="auto" w:sz="4"/>
+              <w:bottom w:val="single" w:color="auto" w:sz="4"/>
+              <w:right w:val="single" w:color="auto" w:sz="4"/>
+            </w:tcBorders>
+            <w:shd w:fill="F7F9FB" w:color="auto" w:val="clear"/>
+            <w:tcMar>
+              <w:top w:type="dxa" w:w="80"/>
+              <w:left w:type="dxa" w:w="90"/>
+              <w:bottom w:type="dxa" w:w="80"/>
+              <w:right w:type="dxa" w:w="90"/>
+            </w:tcMar>
+            <w:vAlign w:val="top"/>
+          </w:tcPr>
+          <w:p>
+            <w:pPr>
+              <w:spacing w:after="0" w:line="240"/>
+            </w:pPr>
+            <w:r>
+              <w:rPr>
+                <w:b/>
+                <w:bCs/>
+                <w:sz w:val="22"/>
+                <w:szCs w:val="22"/>
+              </w:rPr>
+              <w:t xml:space="preserve">Cierre</w:t>
+            </w:r>
+          </w:p>
+        </w:tc>
+        <w:tc>
+          <w:tcPr>
+            <w:tcW w:type="dxa" w:w="1500"/>
+            <w:tcBorders>
+              <w:top w:val="single" w:color="auto" w:sz="4"/>
+              <w:left w:val="single" w:color="auto" w:sz="4"/>
+              <w:bottom w:val="single" w:color="auto" w:sz="4"/>
+              <w:right w:val="single" w:color="auto" w:sz="4"/>
+            </w:tcBorders>
+            <w:shd w:fill="F7F9FB" w:color="auto" w:val="clear"/>
+            <w:tcMar>
+              <w:top w:type="dxa" w:w="80"/>
+              <w:left w:type="dxa" w:w="90"/>
+              <w:bottom w:type="dxa" w:w="80"/>
+              <w:right w:type="dxa" w:w="90"/>
+            </w:tcMar>
+            <w:vAlign w:val="top"/>
+          </w:tcPr>
+          <w:p>
+            <w:pPr>
+              <w:spacing w:after="0" w:line="240"/>
+            </w:pPr>
+            <w:r>
+              <w:rPr>
+                <w:sz w:val="22"/>
+                <w:szCs w:val="22"/>
+              </w:rPr>
+              <w:t xml:space="preserve">15 min</w:t>
+            </w:r>
+          </w:p>
+        </w:tc>
+        <w:tc>
+          <w:tcPr>
+            <w:tcW w:type="dxa" w:w="5938"/>
+            <w:tcBorders>
+              <w:top w:val="single" w:color="auto" w:sz="4"/>
+              <w:left w:val="single" w:color="auto" w:sz="4"/>
+              <w:bottom w:val="single" w:color="auto" w:sz="4"/>
+              <w:right w:val="single" w:color="auto" w:sz="4"/>
+            </w:tcBorders>
+            <w:shd w:fill="F7F9FB" w:color="auto" w:val="clear"/>
+            <w:tcMar>
+              <w:top w:type="dxa" w:w="80"/>
+              <w:left w:type="dxa" w:w="90"/>
+              <w:bottom w:type="dxa" w:w="80"/>
+              <w:right w:type="dxa" w:w="90"/>
+            </w:tcMar>
+            <w:vAlign w:val="top"/>
+          </w:tcPr>
+          <w:p>
+            <w:pPr>
+              <w:spacing w:after="0" w:line="240"/>
+            </w:pPr>
+            <w:r>
+              <w:rPr>
+                <w:sz w:val="22"/>
+                <w:szCs w:val="22"/>
+              </w:rPr>
+              <w:t xml:space="preserve">Contraste de resultados y conclusiones.</w:t>
+            </w:r>
+          </w:p>
+        </w:tc>
+      </w:tr>
+      <w:tr>
+        <w:trPr>
+          <w:cantSplit/>
+        </w:trPr>
+        <w:tc>
+          <w:tcPr>
+            <w:tcW w:type="dxa" w:w="2200"/>
+            <w:tcBorders>
+              <w:top w:val="single" w:color="auto" w:sz="4"/>
+              <w:left w:val="single" w:color="auto" w:sz="4"/>
+              <w:bottom w:val="single" w:color="auto" w:sz="4"/>
+              <w:right w:val="single" w:color="auto" w:sz="4"/>
+            </w:tcBorders>
+            <w:shd w:fill="FFFFFF" w:color="auto" w:val="clear"/>
+            <w:tcMar>
+              <w:top w:type="dxa" w:w="80"/>
+              <w:left w:type="dxa" w:w="90"/>
+              <w:bottom w:type="dxa" w:w="80"/>
+              <w:right w:type="dxa" w:w="90"/>
+            </w:tcMar>
+            <w:vAlign w:val="top"/>
+          </w:tcPr>
+          <w:p>
+            <w:pPr>
+              <w:spacing w:after="0" w:line="240"/>
+            </w:pPr>
+            <w:r>
+              <w:rPr>
+                <w:b/>
+                <w:bCs/>
+                <w:sz w:val="22"/>
+                <w:szCs w:val="22"/>
+              </w:rPr>
+              <w:t xml:space="preserve">Total</w:t>
+            </w:r>
+          </w:p>
+        </w:tc>
+        <w:tc>
+          <w:tcPr>
+            <w:tcW w:type="dxa" w:w="1500"/>
+            <w:tcBorders>
+              <w:top w:val="single" w:color="auto" w:sz="4"/>
+              <w:left w:val="single" w:color="auto" w:sz="4"/>
+              <w:bottom w:val="single" w:color="auto" w:sz="4"/>
+              <w:right w:val="single" w:color="auto" w:sz="4"/>
+            </w:tcBorders>
+            <w:shd w:fill="FFFFFF" w:color="auto" w:val="clear"/>
+            <w:tcMar>
+              <w:top w:type="dxa" w:w="80"/>
+              <w:left w:type="dxa" w:w="90"/>
+              <w:bottom w:type="dxa" w:w="80"/>
+              <w:right w:type="dxa" w:w="90"/>
+            </w:tcMar>
+            <w:vAlign w:val="top"/>
+          </w:tcPr>
+          <w:p>
+            <w:pPr>
+              <w:spacing w:after="0" w:line="240"/>
+            </w:pPr>
+            <w:r>
+              <w:rPr>
+                <w:sz w:val="22"/>
+                <w:szCs w:val="22"/>
+              </w:rPr>
+              <w:t xml:space="preserve">100 min</w:t>
+            </w:r>
+          </w:p>
+        </w:tc>
+        <w:tc>
+          <w:tcPr>
+            <w:tcW w:type="dxa" w:w="5938"/>
+            <w:tcBorders>
+              <w:top w:val="single" w:color="auto" w:sz="4"/>
+              <w:left w:val="single" w:color="auto" w:sz="4"/>
+              <w:bottom w:val="single" w:color="auto" w:sz="4"/>
+              <w:right w:val="single" w:color="auto" w:sz="4"/>
+            </w:tcBorders>
+            <w:shd w:fill="FFFFFF" w:color="auto" w:val="clear"/>
+            <w:tcMar>
+              <w:top w:type="dxa" w:w="80"/>
+              <w:left w:type="dxa" w:w="90"/>
+              <w:bottom w:type="dxa" w:w="80"/>
+              <w:right w:type="dxa" w:w="90"/>
+            </w:tcMar>
+            <w:vAlign w:val="top"/>
+          </w:tcPr>
+          <w:p>
+            <w:pPr>
+              <w:spacing w:after="0" w:line="240"/>
+            </w:pPr>
+            <w:r>
+              <w:rPr>
+                <w:sz w:val="22"/>
+                <w:szCs w:val="22"/>
+              </w:rPr>
+              <w:t xml:space="preserve">Duración del laboratorio para las secciones A y B.</w:t>
             </w:r>
           </w:p>
         </w:tc>
@@ -1147,6 +1547,33 @@
       </w:r>
       <w:r>
         <w:t xml:space="preserve"> los retos quedan como evidencia posterior en el notebook; entregue el enlace verificable en Canvas.</w:t>
+      </w:r>
+    </w:p>
+    <w:p>
+      <w:pPr>
+        <w:pBdr>
+          <w:left w:val="single" w:color="1E3A5F" w:sz="18" w:space="6"/>
+        </w:pBdr>
+        <w:shd w:fill="EEF3F8" w:val="clear"/>
+        <w:spacing w:after="200" w:before="80"/>
+        <w:ind w:left="200"/>
+        <w:jc w:val="both"/>
+      </w:pPr>
+      <w:r>
+        <w:rPr>
+          <w:b/>
+          <w:bCs/>
+          <w:sz w:val="22"/>
+          <w:szCs w:val="22"/>
+        </w:rPr>
+        <w:t xml:space="preserve">En este laboratorio no se enseña programación.</w:t>
+      </w:r>
+      <w:r>
+        <w:rPr>
+          <w:sz w:val="22"/>
+          <w:szCs w:val="22"/>
+        </w:rPr>
+        <w:t xml:space="preserve">  El código ya viene preparado: el estudiante lo ejecuta, lee el resultado y lo interpreta. Lo que se enseña son las consultas SQLite y su lectura.</w:t>
       </w:r>
     </w:p>
     <w:p>

</xml_diff>

<commit_message>
Manuales SQLite corregidos en cuadernos (Básico, Intermedio, Avanzado, Modelado) con informe de revisión; quitar foro del Dirigido 2
Co-Authored-By: Claude Sonnet 5.5 <noreply@anthropic.com>
Claude-Session: https://claude.ai/code/session_01HWf88gfjbnyHET9WH8GMM1
</commit_message>
<xml_diff>
--- a/laboratorios_fgd/LAB-D2-FGD-2026II-DOCENTE-RESUELTO.docx
+++ b/laboratorios_fgd/LAB-D2-FGD-2026II-DOCENTE-RESUELTO.docx
@@ -1535,22 +1535,6 @@
     </w:p>
     <w:p>
       <w:pPr>
-        <w:spacing w:after="160" w:before="0"/>
-        <w:jc w:val="both"/>
-      </w:pPr>
-      <w:r>
-        <w:rPr>
-          <w:b/>
-          <w:bCs/>
-        </w:rPr>
-        <w:t xml:space="preserve">Entregable:</w:t>
-      </w:r>
-      <w:r>
-        <w:t xml:space="preserve"> los retos quedan como evidencia posterior en el notebook; entregue el enlace verificable en Canvas.</w:t>
-      </w:r>
-    </w:p>
-    <w:p>
-      <w:pPr>
         <w:pBdr>
           <w:left w:val="single" w:color="1E3A5F" w:sz="18" w:space="6"/>
         </w:pBdr>
@@ -3895,7 +3879,7 @@
         <w:jc w:val="both"/>
       </w:pPr>
       <w:r>
-        <w:t xml:space="preserve">Resuelva en el notebook los tres retos, ejecute el código y escriba la salida y una interpretación. Entregue el enlace verificable en Canvas.</w:t>
+        <w:t xml:space="preserve">Resuelva en el notebook los tres retos, ejecute el código y escriba la salida y una interpretación.</w:t>
       </w:r>
     </w:p>
     <w:p>
@@ -6937,33 +6921,6 @@
       <w:pPr>
         <w:spacing w:after="120"/>
       </w:pPr>
-    </w:p>
-    <w:p>
-      <w:pPr>
-        <w:pBdr>
-          <w:left w:val="single" w:color="1E3A5F" w:sz="18" w:space="6"/>
-        </w:pBdr>
-        <w:shd w:fill="EEF3F8" w:val="clear"/>
-        <w:spacing w:after="200" w:before="80"/>
-        <w:ind w:left="200"/>
-        <w:jc w:val="both"/>
-      </w:pPr>
-      <w:r>
-        <w:rPr>
-          <w:b/>
-          <w:bCs/>
-          <w:sz w:val="22"/>
-          <w:szCs w:val="22"/>
-        </w:rPr>
-        <w:t xml:space="preserve">Conversión.</w:t>
-      </w:r>
-      <w:r>
-        <w:rPr>
-          <w:sz w:val="22"/>
-          <w:szCs w:val="22"/>
-        </w:rPr>
-        <w:t xml:space="preserve"> La evidencia del notebook corresponde al componente de 0,4 puntos de la actividad semanal: puntaje obtenido ÷ 20 × 0,4. Las cuatro preguntas de Canvas suman los otros 1,6 puntos.</w:t>
-      </w:r>
     </w:p>
     <w:tbl>
       <w:tblPr>

</xml_diff>